<commit_message>
Se hace el primer proyecto de webflux mono
</commit_message>
<xml_diff>
--- a/Semana3/03-Webflux/03-Webflux.docx
+++ b/Semana3/03-Webflux/03-Webflux.docx
@@ -389,8 +389,20 @@
           <w:szCs w:val="32"/>
         </w:rPr>
         <w:lastRenderedPageBreak/>
-        <w:t>Concepto 2.1: HTTP Basic y BCrypt</w:t>
-      </w:r>
+        <w:t xml:space="preserve">Concepto 3: Spring </w:t>
+      </w:r>
+      <w:proofErr w:type="spellStart"/>
+      <w:r>
+        <w:rPr>
+          <w:rFonts w:ascii="Arial" w:hAnsi="Arial" w:cs="Arial"/>
+          <w:b/>
+          <w:bCs/>
+          <w:sz w:val="32"/>
+          <w:szCs w:val="32"/>
+        </w:rPr>
+        <w:t>WebFlux</w:t>
+      </w:r>
+      <w:proofErr w:type="spellEnd"/>
     </w:p>
     <w:p>
       <w:pPr>
@@ -402,6 +414,1034 @@
           <w:szCs w:val="28"/>
         </w:rPr>
       </w:pPr>
+      <w:r>
+        <w:rPr>
+          <w:rFonts w:ascii="Arial" w:hAnsi="Arial" w:cs="Arial"/>
+          <w:sz w:val="28"/>
+          <w:szCs w:val="28"/>
+        </w:rPr>
+        <w:t xml:space="preserve">La programación reactiva sirve para que el servidor no se quede atascado ni desperdicie recursos cuando hay tiempos de espera largos, como ir a la base de datos o llamar a otra API externa. En el modelo tradicional, un hilo de ejecución se queda parado esperando su respuesta. En </w:t>
+      </w:r>
+      <w:proofErr w:type="spellStart"/>
+      <w:r>
+        <w:rPr>
+          <w:rFonts w:ascii="Arial" w:hAnsi="Arial" w:cs="Arial"/>
+          <w:sz w:val="28"/>
+          <w:szCs w:val="28"/>
+        </w:rPr>
+        <w:t>WebFlux</w:t>
+      </w:r>
+      <w:proofErr w:type="spellEnd"/>
+      <w:r>
+        <w:rPr>
+          <w:rFonts w:ascii="Arial" w:hAnsi="Arial" w:cs="Arial"/>
+          <w:sz w:val="28"/>
+          <w:szCs w:val="28"/>
+        </w:rPr>
+        <w:t>, se usa un modelo Push donde unos cuantos hilos atienden todas las peticiones a la vez y se liberan mientras esperan.</w:t>
+      </w:r>
+    </w:p>
+    <w:p>
+      <w:pPr>
+        <w:spacing w:line="360" w:lineRule="auto"/>
+        <w:jc w:val="both"/>
+        <w:rPr>
+          <w:rFonts w:ascii="Arial" w:hAnsi="Arial" w:cs="Arial"/>
+          <w:sz w:val="28"/>
+          <w:szCs w:val="28"/>
+        </w:rPr>
+      </w:pPr>
+      <w:r>
+        <w:rPr>
+          <w:rFonts w:ascii="Arial" w:hAnsi="Arial" w:cs="Arial"/>
+          <w:sz w:val="28"/>
+          <w:szCs w:val="28"/>
+        </w:rPr>
+        <w:t>Para entenderlo bien hay que saber un par de cosas:</w:t>
+      </w:r>
+    </w:p>
+    <w:p>
+      <w:pPr>
+        <w:pStyle w:val="Prrafodelista"/>
+        <w:numPr>
+          <w:ilvl w:val="0"/>
+          <w:numId w:val="13"/>
+        </w:numPr>
+        <w:spacing w:line="360" w:lineRule="auto"/>
+        <w:jc w:val="both"/>
+        <w:rPr>
+          <w:rFonts w:ascii="Arial" w:hAnsi="Arial" w:cs="Arial"/>
+          <w:sz w:val="28"/>
+          <w:szCs w:val="28"/>
+        </w:rPr>
+      </w:pPr>
+      <w:r>
+        <w:rPr>
+          <w:rFonts w:ascii="Arial" w:hAnsi="Arial" w:cs="Arial"/>
+          <w:sz w:val="28"/>
+          <w:szCs w:val="28"/>
+        </w:rPr>
+        <w:t xml:space="preserve">Qué es un flujo: Es básicamente una secuencia asíncrona por donde viajan los datos. Este flujo te avisa por tres canales: cuando llega un dato nuevo con </w:t>
+      </w:r>
+      <w:proofErr w:type="spellStart"/>
+      <w:r>
+        <w:rPr>
+          <w:rFonts w:ascii="Arial" w:hAnsi="Arial" w:cs="Arial"/>
+          <w:sz w:val="28"/>
+          <w:szCs w:val="28"/>
+        </w:rPr>
+        <w:t>onNext</w:t>
+      </w:r>
+      <w:proofErr w:type="spellEnd"/>
+      <w:r>
+        <w:rPr>
+          <w:rFonts w:ascii="Arial" w:hAnsi="Arial" w:cs="Arial"/>
+          <w:sz w:val="28"/>
+          <w:szCs w:val="28"/>
+        </w:rPr>
+        <w:t xml:space="preserve">, si algo tronó con </w:t>
+      </w:r>
+      <w:proofErr w:type="spellStart"/>
+      <w:r>
+        <w:rPr>
+          <w:rFonts w:ascii="Arial" w:hAnsi="Arial" w:cs="Arial"/>
+          <w:sz w:val="28"/>
+          <w:szCs w:val="28"/>
+        </w:rPr>
+        <w:t>onError</w:t>
+      </w:r>
+      <w:proofErr w:type="spellEnd"/>
+      <w:r>
+        <w:rPr>
+          <w:rFonts w:ascii="Arial" w:hAnsi="Arial" w:cs="Arial"/>
+          <w:sz w:val="28"/>
+          <w:szCs w:val="28"/>
+        </w:rPr>
+        <w:t xml:space="preserve"> o si ya se terminó de enviar todo con </w:t>
+      </w:r>
+      <w:proofErr w:type="spellStart"/>
+      <w:r>
+        <w:rPr>
+          <w:rFonts w:ascii="Arial" w:hAnsi="Arial" w:cs="Arial"/>
+          <w:sz w:val="28"/>
+          <w:szCs w:val="28"/>
+        </w:rPr>
+        <w:t>onComplete</w:t>
+      </w:r>
+      <w:proofErr w:type="spellEnd"/>
+      <w:r>
+        <w:rPr>
+          <w:rFonts w:ascii="Arial" w:hAnsi="Arial" w:cs="Arial"/>
+          <w:sz w:val="28"/>
+          <w:szCs w:val="28"/>
+        </w:rPr>
+        <w:t>.</w:t>
+      </w:r>
+    </w:p>
+    <w:p>
+      <w:pPr>
+        <w:pStyle w:val="Prrafodelista"/>
+        <w:numPr>
+          <w:ilvl w:val="0"/>
+          <w:numId w:val="13"/>
+        </w:numPr>
+        <w:spacing w:line="360" w:lineRule="auto"/>
+        <w:jc w:val="both"/>
+        <w:rPr>
+          <w:rFonts w:ascii="Arial" w:hAnsi="Arial" w:cs="Arial"/>
+          <w:sz w:val="28"/>
+          <w:szCs w:val="28"/>
+        </w:rPr>
+      </w:pPr>
+      <w:r>
+        <w:rPr>
+          <w:rFonts w:ascii="Arial" w:hAnsi="Arial" w:cs="Arial"/>
+          <w:sz w:val="28"/>
+          <w:szCs w:val="28"/>
+        </w:rPr>
+        <w:t xml:space="preserve">Son flujos </w:t>
+      </w:r>
+      <w:proofErr w:type="spellStart"/>
+      <w:r>
+        <w:rPr>
+          <w:rFonts w:ascii="Arial" w:hAnsi="Arial" w:cs="Arial"/>
+          <w:sz w:val="28"/>
+          <w:szCs w:val="28"/>
+        </w:rPr>
+        <w:t>Lazy</w:t>
+      </w:r>
+      <w:proofErr w:type="spellEnd"/>
+      <w:r>
+        <w:rPr>
+          <w:rFonts w:ascii="Arial" w:hAnsi="Arial" w:cs="Arial"/>
+          <w:sz w:val="28"/>
+          <w:szCs w:val="28"/>
+        </w:rPr>
+        <w:t xml:space="preserve"> o perezosos: Esto significa que cuando el código crea el flujo, en realidad no hace nada. No ejecuta consultas ni procesa nada hasta que un cliente finalmente se suscribe para pedir los datos. Es como tener la </w:t>
+      </w:r>
+      <w:proofErr w:type="gramStart"/>
+      <w:r>
+        <w:rPr>
+          <w:rFonts w:ascii="Arial" w:hAnsi="Arial" w:cs="Arial"/>
+          <w:sz w:val="28"/>
+          <w:szCs w:val="28"/>
+        </w:rPr>
+        <w:t>receta</w:t>
+      </w:r>
+      <w:proofErr w:type="gramEnd"/>
+      <w:r>
+        <w:rPr>
+          <w:rFonts w:ascii="Arial" w:hAnsi="Arial" w:cs="Arial"/>
+          <w:sz w:val="28"/>
+          <w:szCs w:val="28"/>
+        </w:rPr>
+        <w:t xml:space="preserve"> pero no cocinar el platillo hasta que llega el cliente.</w:t>
+      </w:r>
+    </w:p>
+    <w:p>
+      <w:pPr>
+        <w:spacing w:line="360" w:lineRule="auto"/>
+        <w:jc w:val="both"/>
+        <w:rPr>
+          <w:rFonts w:ascii="Arial" w:hAnsi="Arial" w:cs="Arial"/>
+          <w:sz w:val="28"/>
+          <w:szCs w:val="28"/>
+        </w:rPr>
+      </w:pPr>
+      <w:r>
+        <w:rPr>
+          <w:rFonts w:ascii="Arial" w:hAnsi="Arial" w:cs="Arial"/>
+          <w:sz w:val="28"/>
+          <w:szCs w:val="28"/>
+        </w:rPr>
+        <w:t xml:space="preserve">En los proyectos </w:t>
+      </w:r>
+      <w:proofErr w:type="spellStart"/>
+      <w:r>
+        <w:rPr>
+          <w:rFonts w:ascii="Arial" w:hAnsi="Arial" w:cs="Arial"/>
+          <w:sz w:val="28"/>
+          <w:szCs w:val="28"/>
+        </w:rPr>
+        <w:t>webflux</w:t>
+      </w:r>
+      <w:proofErr w:type="spellEnd"/>
+      <w:r>
+        <w:rPr>
+          <w:rFonts w:ascii="Arial" w:hAnsi="Arial" w:cs="Arial"/>
+          <w:sz w:val="28"/>
+          <w:szCs w:val="28"/>
+        </w:rPr>
+        <w:t xml:space="preserve">-mono y </w:t>
+      </w:r>
+      <w:proofErr w:type="spellStart"/>
+      <w:r>
+        <w:rPr>
+          <w:rFonts w:ascii="Arial" w:hAnsi="Arial" w:cs="Arial"/>
+          <w:sz w:val="28"/>
+          <w:szCs w:val="28"/>
+        </w:rPr>
+        <w:t>webflux</w:t>
+      </w:r>
+      <w:proofErr w:type="spellEnd"/>
+      <w:r>
+        <w:rPr>
+          <w:rFonts w:ascii="Arial" w:hAnsi="Arial" w:cs="Arial"/>
+          <w:sz w:val="28"/>
+          <w:szCs w:val="28"/>
+        </w:rPr>
+        <w:t>-flux, este concepto se aplicó en los siguientes archivos:</w:t>
+      </w:r>
+    </w:p>
+    <w:p>
+      <w:pPr>
+        <w:pStyle w:val="Prrafodelista"/>
+        <w:numPr>
+          <w:ilvl w:val="0"/>
+          <w:numId w:val="15"/>
+        </w:numPr>
+        <w:spacing w:line="360" w:lineRule="auto"/>
+        <w:jc w:val="both"/>
+        <w:rPr>
+          <w:rFonts w:ascii="Arial" w:hAnsi="Arial" w:cs="Arial"/>
+          <w:sz w:val="28"/>
+          <w:szCs w:val="28"/>
+        </w:rPr>
+      </w:pPr>
+      <w:r>
+        <w:rPr>
+          <w:rFonts w:ascii="Arial" w:hAnsi="Arial" w:cs="Arial"/>
+          <w:sz w:val="28"/>
+          <w:szCs w:val="28"/>
+        </w:rPr>
+        <w:t xml:space="preserve">El uso de Mono para cero o un elemento: En el archivo </w:t>
+      </w:r>
+      <w:proofErr w:type="spellStart"/>
+      <w:r>
+        <w:rPr>
+          <w:rFonts w:ascii="Arial" w:hAnsi="Arial" w:cs="Arial"/>
+          <w:sz w:val="28"/>
+          <w:szCs w:val="28"/>
+        </w:rPr>
+        <w:t>rest</w:t>
+      </w:r>
+      <w:proofErr w:type="spellEnd"/>
+      <w:r>
+        <w:rPr>
+          <w:rFonts w:ascii="Arial" w:hAnsi="Arial" w:cs="Arial"/>
+          <w:sz w:val="28"/>
+          <w:szCs w:val="28"/>
+        </w:rPr>
+        <w:t xml:space="preserve">/EmployeeRestController.java el método </w:t>
+      </w:r>
+      <w:proofErr w:type="spellStart"/>
+      <w:r>
+        <w:rPr>
+          <w:rFonts w:ascii="Arial" w:hAnsi="Arial" w:cs="Arial"/>
+          <w:sz w:val="28"/>
+          <w:szCs w:val="28"/>
+        </w:rPr>
+        <w:t>findById</w:t>
+      </w:r>
+      <w:proofErr w:type="spellEnd"/>
+      <w:r>
+        <w:rPr>
+          <w:rFonts w:ascii="Arial" w:hAnsi="Arial" w:cs="Arial"/>
+          <w:sz w:val="28"/>
+          <w:szCs w:val="28"/>
+        </w:rPr>
+        <w:t xml:space="preserve"> no devuelve el dato directo, sino un Mono de </w:t>
+      </w:r>
+      <w:proofErr w:type="spellStart"/>
+      <w:r>
+        <w:rPr>
+          <w:rFonts w:ascii="Arial" w:hAnsi="Arial" w:cs="Arial"/>
+          <w:sz w:val="28"/>
+          <w:szCs w:val="28"/>
+        </w:rPr>
+        <w:t>Employee</w:t>
+      </w:r>
+      <w:proofErr w:type="spellEnd"/>
+      <w:r>
+        <w:rPr>
+          <w:rFonts w:ascii="Arial" w:hAnsi="Arial" w:cs="Arial"/>
+          <w:sz w:val="28"/>
+          <w:szCs w:val="28"/>
+        </w:rPr>
+        <w:t>. Así el hilo de ejecución se suelta de inmediato.</w:t>
+      </w:r>
+    </w:p>
+    <w:p>
+      <w:pPr>
+        <w:spacing w:line="360" w:lineRule="auto"/>
+        <w:jc w:val="both"/>
+        <w:rPr>
+          <w:rFonts w:ascii="Arial" w:hAnsi="Arial" w:cs="Arial"/>
+          <w:sz w:val="28"/>
+          <w:szCs w:val="28"/>
+        </w:rPr>
+      </w:pPr>
+    </w:p>
+    <w:p>
+      <w:pPr>
+        <w:pStyle w:val="Prrafodelista"/>
+        <w:numPr>
+          <w:ilvl w:val="0"/>
+          <w:numId w:val="15"/>
+        </w:numPr>
+        <w:spacing w:line="360" w:lineRule="auto"/>
+        <w:jc w:val="both"/>
+        <w:rPr>
+          <w:rFonts w:ascii="Arial" w:hAnsi="Arial" w:cs="Arial"/>
+          <w:sz w:val="28"/>
+          <w:szCs w:val="28"/>
+        </w:rPr>
+      </w:pPr>
+      <w:r>
+        <w:rPr>
+          <w:rFonts w:ascii="Arial" w:hAnsi="Arial" w:cs="Arial"/>
+          <w:sz w:val="28"/>
+          <w:szCs w:val="28"/>
+        </w:rPr>
+        <w:lastRenderedPageBreak/>
+        <w:t>El uso de Flux para cero a muchos elementos: Sirve para flujos continuos que no terminan rápido, como si un sensor mandara datos poco a poco.</w:t>
+      </w:r>
+    </w:p>
+    <w:p>
+      <w:pPr>
+        <w:pStyle w:val="Prrafodelista"/>
+        <w:numPr>
+          <w:ilvl w:val="0"/>
+          <w:numId w:val="15"/>
+        </w:numPr>
+        <w:spacing w:line="360" w:lineRule="auto"/>
+        <w:jc w:val="both"/>
+        <w:rPr>
+          <w:rFonts w:ascii="Arial" w:hAnsi="Arial" w:cs="Arial"/>
+          <w:sz w:val="28"/>
+          <w:szCs w:val="28"/>
+        </w:rPr>
+      </w:pPr>
+      <w:r>
+        <w:rPr>
+          <w:rFonts w:ascii="Arial" w:hAnsi="Arial" w:cs="Arial"/>
+          <w:sz w:val="28"/>
+          <w:szCs w:val="28"/>
+        </w:rPr>
+        <w:t xml:space="preserve">La lentitud simulada: En repo/EmployeeRepository.java se usó un </w:t>
+      </w:r>
+      <w:proofErr w:type="spellStart"/>
+      <w:r>
+        <w:rPr>
+          <w:rFonts w:ascii="Arial" w:hAnsi="Arial" w:cs="Arial"/>
+          <w:sz w:val="28"/>
+          <w:szCs w:val="28"/>
+        </w:rPr>
+        <w:t>delayElement</w:t>
+      </w:r>
+      <w:proofErr w:type="spellEnd"/>
+      <w:r>
+        <w:rPr>
+          <w:rFonts w:ascii="Arial" w:hAnsi="Arial" w:cs="Arial"/>
+          <w:sz w:val="28"/>
+          <w:szCs w:val="28"/>
+        </w:rPr>
+        <w:t xml:space="preserve"> para forzar a que la respuesta tarde 5 segundos. Esto simula una base de datos pesada.</w:t>
+      </w:r>
+    </w:p>
+    <w:p>
+      <w:pPr>
+        <w:pStyle w:val="Prrafodelista"/>
+        <w:numPr>
+          <w:ilvl w:val="0"/>
+          <w:numId w:val="15"/>
+        </w:numPr>
+        <w:spacing w:line="360" w:lineRule="auto"/>
+        <w:jc w:val="both"/>
+        <w:rPr>
+          <w:rFonts w:ascii="Arial" w:hAnsi="Arial" w:cs="Arial"/>
+          <w:sz w:val="28"/>
+          <w:szCs w:val="28"/>
+        </w:rPr>
+      </w:pPr>
+      <w:r>
+        <w:rPr>
+          <w:rFonts w:ascii="Arial" w:hAnsi="Arial" w:cs="Arial"/>
+          <w:sz w:val="28"/>
+          <w:szCs w:val="28"/>
+        </w:rPr>
+        <w:t xml:space="preserve">El contraste para ver lo que no se debe hacer: Para poder comparar los tiempos, se dejó el archivo </w:t>
+      </w:r>
+      <w:proofErr w:type="spellStart"/>
+      <w:r>
+        <w:rPr>
+          <w:rFonts w:ascii="Arial" w:hAnsi="Arial" w:cs="Arial"/>
+          <w:sz w:val="28"/>
+          <w:szCs w:val="28"/>
+        </w:rPr>
+        <w:t>rest</w:t>
+      </w:r>
+      <w:proofErr w:type="spellEnd"/>
+      <w:r>
+        <w:rPr>
+          <w:rFonts w:ascii="Arial" w:hAnsi="Arial" w:cs="Arial"/>
+          <w:sz w:val="28"/>
+          <w:szCs w:val="28"/>
+        </w:rPr>
+        <w:t xml:space="preserve">/BloqueanteRestController.java que usa un </w:t>
+      </w:r>
+      <w:proofErr w:type="spellStart"/>
+      <w:r>
+        <w:rPr>
+          <w:rFonts w:ascii="Arial" w:hAnsi="Arial" w:cs="Arial"/>
+          <w:sz w:val="28"/>
+          <w:szCs w:val="28"/>
+        </w:rPr>
+        <w:t>Thread.sleep</w:t>
+      </w:r>
+      <w:proofErr w:type="spellEnd"/>
+      <w:r>
+        <w:rPr>
+          <w:rFonts w:ascii="Arial" w:hAnsi="Arial" w:cs="Arial"/>
+          <w:sz w:val="28"/>
+          <w:szCs w:val="28"/>
+        </w:rPr>
+        <w:t xml:space="preserve"> normal de Java.</w:t>
+      </w:r>
+    </w:p>
+    <w:p>
+      <w:pPr>
+        <w:pStyle w:val="Prrafodelista"/>
+        <w:numPr>
+          <w:ilvl w:val="0"/>
+          <w:numId w:val="15"/>
+        </w:numPr>
+        <w:spacing w:line="360" w:lineRule="auto"/>
+        <w:jc w:val="both"/>
+        <w:rPr>
+          <w:rFonts w:ascii="Arial" w:hAnsi="Arial" w:cs="Arial"/>
+          <w:sz w:val="28"/>
+          <w:szCs w:val="28"/>
+        </w:rPr>
+      </w:pPr>
+      <w:r>
+        <w:rPr>
+          <w:rFonts w:ascii="Arial" w:hAnsi="Arial" w:cs="Arial"/>
+          <w:sz w:val="28"/>
+          <w:szCs w:val="28"/>
+        </w:rPr>
+        <w:t xml:space="preserve">Las pruebas del concepto </w:t>
+      </w:r>
+      <w:proofErr w:type="spellStart"/>
+      <w:r>
+        <w:rPr>
+          <w:rFonts w:ascii="Arial" w:hAnsi="Arial" w:cs="Arial"/>
+          <w:sz w:val="28"/>
+          <w:szCs w:val="28"/>
+        </w:rPr>
+        <w:t>Lazy</w:t>
+      </w:r>
+      <w:proofErr w:type="spellEnd"/>
+      <w:r>
+        <w:rPr>
+          <w:rFonts w:ascii="Arial" w:hAnsi="Arial" w:cs="Arial"/>
+          <w:sz w:val="28"/>
+          <w:szCs w:val="28"/>
+        </w:rPr>
+        <w:t xml:space="preserve">: En el archivo EmployeeRepositoryTest.java se creó </w:t>
+      </w:r>
+      <w:proofErr w:type="gramStart"/>
+      <w:r>
+        <w:rPr>
+          <w:rFonts w:ascii="Arial" w:hAnsi="Arial" w:cs="Arial"/>
+          <w:sz w:val="28"/>
+          <w:szCs w:val="28"/>
+        </w:rPr>
+        <w:t>un test</w:t>
+      </w:r>
+      <w:proofErr w:type="gramEnd"/>
+      <w:r>
+        <w:rPr>
+          <w:rFonts w:ascii="Arial" w:hAnsi="Arial" w:cs="Arial"/>
+          <w:sz w:val="28"/>
+          <w:szCs w:val="28"/>
+        </w:rPr>
+        <w:t xml:space="preserve"> específico que demuestra que si se construye un </w:t>
+      </w:r>
+      <w:proofErr w:type="gramStart"/>
+      <w:r>
+        <w:rPr>
+          <w:rFonts w:ascii="Arial" w:hAnsi="Arial" w:cs="Arial"/>
+          <w:sz w:val="28"/>
+          <w:szCs w:val="28"/>
+        </w:rPr>
+        <w:t>Mono</w:t>
+      </w:r>
+      <w:proofErr w:type="gramEnd"/>
+      <w:r>
+        <w:rPr>
+          <w:rFonts w:ascii="Arial" w:hAnsi="Arial" w:cs="Arial"/>
+          <w:sz w:val="28"/>
+          <w:szCs w:val="28"/>
+        </w:rPr>
+        <w:t xml:space="preserve"> pero nadie se suscribe a él, el código que trae adentro jamás se ejecuta. </w:t>
+      </w:r>
+      <w:proofErr w:type="gramStart"/>
+      <w:r>
+        <w:rPr>
+          <w:rFonts w:ascii="Arial" w:hAnsi="Arial" w:cs="Arial"/>
+          <w:sz w:val="28"/>
+          <w:szCs w:val="28"/>
+        </w:rPr>
+        <w:t>Además</w:t>
+      </w:r>
+      <w:proofErr w:type="gramEnd"/>
+      <w:r>
+        <w:rPr>
+          <w:rFonts w:ascii="Arial" w:hAnsi="Arial" w:cs="Arial"/>
+          <w:sz w:val="28"/>
+          <w:szCs w:val="28"/>
+        </w:rPr>
+        <w:t xml:space="preserve"> se usó </w:t>
+      </w:r>
+      <w:proofErr w:type="spellStart"/>
+      <w:r>
+        <w:rPr>
+          <w:rFonts w:ascii="Arial" w:hAnsi="Arial" w:cs="Arial"/>
+          <w:sz w:val="28"/>
+          <w:szCs w:val="28"/>
+        </w:rPr>
+        <w:t>StepVerifier</w:t>
+      </w:r>
+      <w:proofErr w:type="spellEnd"/>
+      <w:r>
+        <w:rPr>
+          <w:rFonts w:ascii="Arial" w:hAnsi="Arial" w:cs="Arial"/>
+          <w:sz w:val="28"/>
+          <w:szCs w:val="28"/>
+        </w:rPr>
+        <w:t xml:space="preserve"> para comprobar los 5 segundos de latencia simulada sin tener que esperar ese tiempo real al correr las pruebas.</w:t>
+      </w:r>
+    </w:p>
+    <w:p>
+      <w:pPr>
+        <w:spacing w:line="360" w:lineRule="auto"/>
+        <w:jc w:val="both"/>
+        <w:rPr>
+          <w:rFonts w:ascii="Arial" w:hAnsi="Arial" w:cs="Arial"/>
+          <w:sz w:val="28"/>
+          <w:szCs w:val="28"/>
+        </w:rPr>
+      </w:pPr>
+      <w:r>
+        <w:rPr>
+          <w:rFonts w:ascii="Arial" w:hAnsi="Arial" w:cs="Arial"/>
+          <w:sz w:val="28"/>
+          <w:szCs w:val="28"/>
+        </w:rPr>
+        <w:t>Aquí se muestra la ejecución del script probar.ps1</w:t>
+      </w:r>
+    </w:p>
+    <w:p>
+      <w:pPr>
+        <w:spacing w:line="360" w:lineRule="auto"/>
+        <w:jc w:val="both"/>
+        <w:rPr>
+          <w:rFonts w:ascii="Arial" w:hAnsi="Arial" w:cs="Arial"/>
+          <w:sz w:val="28"/>
+          <w:szCs w:val="28"/>
+        </w:rPr>
+      </w:pPr>
+      <w:r>
+        <w:rPr>
+          <w:rFonts w:ascii="Arial" w:hAnsi="Arial" w:cs="Arial"/>
+          <w:sz w:val="28"/>
+          <w:szCs w:val="28"/>
+        </w:rPr>
+        <w:drawing>
+          <wp:inline distT="0" distB="0" distL="0" distR="0" wp14:anchorId="194E8A0E" wp14:editId="3BAF1D1F">
+            <wp:extent cx="5612130" cy="2781300"/>
+            <wp:effectExtent l="0" t="0" r="7620" b="0"/>
+            <wp:docPr id="419928520" name="Imagen 1"/>
+            <wp:cNvGraphicFramePr>
+              <a:graphicFrameLocks xmlns:a="http://schemas.openxmlformats.org/drawingml/2006/main" noChangeAspect="1"/>
+            </wp:cNvGraphicFramePr>
+            <a:graphic xmlns:a="http://schemas.openxmlformats.org/drawingml/2006/main">
+              <a:graphicData uri="http://schemas.openxmlformats.org/drawingml/2006/picture">
+                <pic:pic xmlns:pic="http://schemas.openxmlformats.org/drawingml/2006/picture">
+                  <pic:nvPicPr>
+                    <pic:cNvPr id="419928520" name=""/>
+                    <pic:cNvPicPr/>
+                  </pic:nvPicPr>
+                  <pic:blipFill>
+                    <a:blip r:embed="rId7"/>
+                    <a:stretch>
+                      <a:fillRect/>
+                    </a:stretch>
+                  </pic:blipFill>
+                  <pic:spPr>
+                    <a:xfrm>
+                      <a:off x="0" y="0"/>
+                      <a:ext cx="5612130" cy="2781300"/>
+                    </a:xfrm>
+                    <a:prstGeom prst="rect">
+                      <a:avLst/>
+                    </a:prstGeom>
+                  </pic:spPr>
+                </pic:pic>
+              </a:graphicData>
+            </a:graphic>
+          </wp:inline>
+        </w:drawing>
+      </w:r>
+    </w:p>
+    <w:p>
+      <w:pPr>
+        <w:spacing w:line="360" w:lineRule="auto"/>
+        <w:jc w:val="both"/>
+        <w:rPr>
+          <w:rFonts w:ascii="Arial" w:hAnsi="Arial" w:cs="Arial"/>
+          <w:sz w:val="28"/>
+          <w:szCs w:val="28"/>
+        </w:rPr>
+      </w:pPr>
+      <w:r>
+        <w:rPr>
+          <w:rFonts w:ascii="Arial" w:hAnsi="Arial" w:cs="Arial"/>
+          <w:sz w:val="28"/>
+          <w:szCs w:val="28"/>
+        </w:rPr>
+        <w:lastRenderedPageBreak/>
+        <w:t xml:space="preserve">La imagen demuestra el funcionamiento de los </w:t>
+      </w:r>
+      <w:proofErr w:type="spellStart"/>
+      <w:r>
+        <w:rPr>
+          <w:rFonts w:ascii="Arial" w:hAnsi="Arial" w:cs="Arial"/>
+          <w:sz w:val="28"/>
+          <w:szCs w:val="28"/>
+        </w:rPr>
+        <w:t>endpoints</w:t>
+      </w:r>
+      <w:proofErr w:type="spellEnd"/>
+      <w:r>
+        <w:rPr>
+          <w:rFonts w:ascii="Arial" w:hAnsi="Arial" w:cs="Arial"/>
+          <w:sz w:val="28"/>
+          <w:szCs w:val="28"/>
+        </w:rPr>
+        <w:t xml:space="preserve"> que devuelven un Mono. Se observa cómo el sistema maneja correctamente las respuestas vacías y cómo el canal de error atrapa las fallas sin que el servidor se caiga devolviendo un plan de respaldo. </w:t>
+      </w:r>
+    </w:p>
+    <w:p>
+      <w:pPr>
+        <w:spacing w:line="360" w:lineRule="auto"/>
+        <w:jc w:val="both"/>
+        <w:rPr>
+          <w:rFonts w:ascii="Arial" w:hAnsi="Arial" w:cs="Arial"/>
+          <w:sz w:val="28"/>
+          <w:szCs w:val="28"/>
+        </w:rPr>
+      </w:pPr>
+      <w:r>
+        <w:rPr>
+          <w:rFonts w:ascii="Arial" w:hAnsi="Arial" w:cs="Arial"/>
+          <w:sz w:val="28"/>
+          <w:szCs w:val="28"/>
+        </w:rPr>
+        <w:t xml:space="preserve">En la última parte se comprueba que el servidor recicla un grupo muy pequeño de hilos para atender todas las peticiones, lo cual es la base del </w:t>
+      </w:r>
+      <w:proofErr w:type="spellStart"/>
+      <w:r>
+        <w:rPr>
+          <w:rFonts w:ascii="Arial" w:hAnsi="Arial" w:cs="Arial"/>
+          <w:sz w:val="28"/>
+          <w:szCs w:val="28"/>
+        </w:rPr>
+        <w:t>event</w:t>
+      </w:r>
+      <w:proofErr w:type="spellEnd"/>
+      <w:r>
+        <w:rPr>
+          <w:rFonts w:ascii="Arial" w:hAnsi="Arial" w:cs="Arial"/>
+          <w:sz w:val="28"/>
+          <w:szCs w:val="28"/>
+        </w:rPr>
+        <w:t xml:space="preserve"> </w:t>
+      </w:r>
+      <w:proofErr w:type="spellStart"/>
+      <w:r>
+        <w:rPr>
+          <w:rFonts w:ascii="Arial" w:hAnsi="Arial" w:cs="Arial"/>
+          <w:sz w:val="28"/>
+          <w:szCs w:val="28"/>
+        </w:rPr>
+        <w:t>loop</w:t>
+      </w:r>
+      <w:proofErr w:type="spellEnd"/>
+      <w:r>
+        <w:rPr>
+          <w:rFonts w:ascii="Arial" w:hAnsi="Arial" w:cs="Arial"/>
+          <w:sz w:val="28"/>
+          <w:szCs w:val="28"/>
+        </w:rPr>
+        <w:t xml:space="preserve"> de Netty.</w:t>
+      </w:r>
+    </w:p>
+    <w:p>
+      <w:pPr>
+        <w:spacing w:line="360" w:lineRule="auto"/>
+        <w:jc w:val="both"/>
+        <w:rPr>
+          <w:rFonts w:ascii="Arial" w:hAnsi="Arial" w:cs="Arial"/>
+          <w:sz w:val="28"/>
+          <w:szCs w:val="28"/>
+        </w:rPr>
+      </w:pPr>
+      <w:r>
+        <w:rPr>
+          <w:rFonts w:ascii="Arial" w:hAnsi="Arial" w:cs="Arial"/>
+          <w:sz w:val="28"/>
+          <w:szCs w:val="28"/>
+        </w:rPr>
+        <w:t>Ejecución del archivo comparar.ps1</w:t>
+      </w:r>
+    </w:p>
+    <w:p>
+      <w:pPr>
+        <w:spacing w:line="360" w:lineRule="auto"/>
+        <w:jc w:val="both"/>
+        <w:rPr>
+          <w:rFonts w:ascii="Arial" w:hAnsi="Arial" w:cs="Arial"/>
+          <w:sz w:val="28"/>
+          <w:szCs w:val="28"/>
+        </w:rPr>
+      </w:pPr>
+      <w:r>
+        <w:rPr>
+          <w:rFonts w:ascii="Arial" w:hAnsi="Arial" w:cs="Arial"/>
+          <w:sz w:val="28"/>
+          <w:szCs w:val="28"/>
+        </w:rPr>
+        <w:drawing>
+          <wp:inline distT="0" distB="0" distL="0" distR="0" wp14:anchorId="527DA688" wp14:editId="4CF8E7DA">
+            <wp:extent cx="5612130" cy="2887980"/>
+            <wp:effectExtent l="0" t="0" r="7620" b="7620"/>
+            <wp:docPr id="97528730" name="Imagen 1"/>
+            <wp:cNvGraphicFramePr>
+              <a:graphicFrameLocks xmlns:a="http://schemas.openxmlformats.org/drawingml/2006/main" noChangeAspect="1"/>
+            </wp:cNvGraphicFramePr>
+            <a:graphic xmlns:a="http://schemas.openxmlformats.org/drawingml/2006/main">
+              <a:graphicData uri="http://schemas.openxmlformats.org/drawingml/2006/picture">
+                <pic:pic xmlns:pic="http://schemas.openxmlformats.org/drawingml/2006/picture">
+                  <pic:nvPicPr>
+                    <pic:cNvPr id="97528730" name=""/>
+                    <pic:cNvPicPr/>
+                  </pic:nvPicPr>
+                  <pic:blipFill>
+                    <a:blip r:embed="rId8"/>
+                    <a:stretch>
+                      <a:fillRect/>
+                    </a:stretch>
+                  </pic:blipFill>
+                  <pic:spPr>
+                    <a:xfrm>
+                      <a:off x="0" y="0"/>
+                      <a:ext cx="5612130" cy="2887980"/>
+                    </a:xfrm>
+                    <a:prstGeom prst="rect">
+                      <a:avLst/>
+                    </a:prstGeom>
+                  </pic:spPr>
+                </pic:pic>
+              </a:graphicData>
+            </a:graphic>
+          </wp:inline>
+        </w:drawing>
+      </w:r>
+    </w:p>
+    <w:p>
+      <w:pPr>
+        <w:spacing w:line="360" w:lineRule="auto"/>
+        <w:jc w:val="both"/>
+        <w:rPr>
+          <w:rFonts w:ascii="Arial" w:hAnsi="Arial" w:cs="Arial"/>
+          <w:sz w:val="28"/>
+          <w:szCs w:val="28"/>
+        </w:rPr>
+      </w:pPr>
+      <w:r>
+        <w:rPr>
+          <w:rFonts w:ascii="Arial" w:hAnsi="Arial" w:cs="Arial"/>
+          <w:sz w:val="28"/>
+          <w:szCs w:val="28"/>
+        </w:rPr>
+        <w:t xml:space="preserve">Esta es la demostración del porqué </w:t>
+      </w:r>
+      <w:proofErr w:type="spellStart"/>
+      <w:r>
+        <w:rPr>
+          <w:rFonts w:ascii="Arial" w:hAnsi="Arial" w:cs="Arial"/>
+          <w:sz w:val="28"/>
+          <w:szCs w:val="28"/>
+        </w:rPr>
+        <w:t>WebFlux</w:t>
+      </w:r>
+      <w:proofErr w:type="spellEnd"/>
+      <w:r>
+        <w:rPr>
+          <w:rFonts w:ascii="Arial" w:hAnsi="Arial" w:cs="Arial"/>
+          <w:sz w:val="28"/>
+          <w:szCs w:val="28"/>
+        </w:rPr>
+        <w:t xml:space="preserve"> es superior bajo carga. Al lanzar 50 peticiones simultáneas, el </w:t>
+      </w:r>
+      <w:proofErr w:type="spellStart"/>
+      <w:r>
+        <w:rPr>
+          <w:rFonts w:ascii="Arial" w:hAnsi="Arial" w:cs="Arial"/>
+          <w:sz w:val="28"/>
+          <w:szCs w:val="28"/>
+        </w:rPr>
+        <w:t>endpoint</w:t>
+      </w:r>
+      <w:proofErr w:type="spellEnd"/>
+      <w:r>
+        <w:rPr>
+          <w:rFonts w:ascii="Arial" w:hAnsi="Arial" w:cs="Arial"/>
+          <w:sz w:val="28"/>
+          <w:szCs w:val="28"/>
+        </w:rPr>
+        <w:t xml:space="preserve"> reactivo tardó solo 5 segundos en total porque liberó los hilos mientras la base de datos simulada respondía. Por el contrario, el </w:t>
+      </w:r>
+      <w:proofErr w:type="spellStart"/>
+      <w:r>
+        <w:rPr>
+          <w:rFonts w:ascii="Arial" w:hAnsi="Arial" w:cs="Arial"/>
+          <w:sz w:val="28"/>
+          <w:szCs w:val="28"/>
+        </w:rPr>
+        <w:t>endpoint</w:t>
+      </w:r>
+      <w:proofErr w:type="spellEnd"/>
+      <w:r>
+        <w:rPr>
+          <w:rFonts w:ascii="Arial" w:hAnsi="Arial" w:cs="Arial"/>
+          <w:sz w:val="28"/>
+          <w:szCs w:val="28"/>
+        </w:rPr>
+        <w:t xml:space="preserve"> bloqueante tardó muchísimo más tiempo porque durmió los hilos del servidor, obligando a las demás peticiones a hacer fila para ser atendidas.</w:t>
+      </w:r>
+    </w:p>
+    <w:p>
+      <w:pPr>
+        <w:spacing w:line="360" w:lineRule="auto"/>
+        <w:jc w:val="both"/>
+        <w:rPr>
+          <w:rFonts w:ascii="Arial" w:hAnsi="Arial" w:cs="Arial"/>
+          <w:sz w:val="28"/>
+          <w:szCs w:val="28"/>
+        </w:rPr>
+      </w:pPr>
+    </w:p>
+    <w:p>
+      <w:pPr>
+        <w:spacing w:line="360" w:lineRule="auto"/>
+        <w:jc w:val="both"/>
+        <w:rPr>
+          <w:rFonts w:ascii="Arial" w:hAnsi="Arial" w:cs="Arial"/>
+          <w:sz w:val="28"/>
+          <w:szCs w:val="28"/>
+        </w:rPr>
+      </w:pPr>
+      <w:r>
+        <w:rPr>
+          <w:rFonts w:ascii="Arial" w:hAnsi="Arial" w:cs="Arial"/>
+          <w:sz w:val="28"/>
+          <w:szCs w:val="28"/>
+        </w:rPr>
+        <w:lastRenderedPageBreak/>
+        <w:t xml:space="preserve">La diferencia al probarlo: Si se corre la versión bloqueante mandándole 50 peticiones de golpe, el servidor se atraganta porque tiene muy pocos hilos. Las peticiones hacen fila y el proceso tarda casi un minuto en terminar. En cambio, con </w:t>
+      </w:r>
+      <w:proofErr w:type="spellStart"/>
+      <w:r>
+        <w:rPr>
+          <w:rFonts w:ascii="Arial" w:hAnsi="Arial" w:cs="Arial"/>
+          <w:sz w:val="28"/>
+          <w:szCs w:val="28"/>
+        </w:rPr>
+        <w:t>WebFlux</w:t>
+      </w:r>
+      <w:proofErr w:type="spellEnd"/>
+      <w:r>
+        <w:rPr>
+          <w:rFonts w:ascii="Arial" w:hAnsi="Arial" w:cs="Arial"/>
+          <w:sz w:val="28"/>
+          <w:szCs w:val="28"/>
+        </w:rPr>
+        <w:t>, como los hilos nunca se bloquean, las 50 peticiones se atienden casi al mismo tiempo y todo termina en los mismos 5 segundos.</w:t>
+      </w:r>
+    </w:p>
+    <w:p>
+      <w:pPr>
+        <w:spacing w:line="360" w:lineRule="auto"/>
+        <w:jc w:val="both"/>
+        <w:rPr>
+          <w:rFonts w:ascii="Arial" w:hAnsi="Arial" w:cs="Arial"/>
+          <w:sz w:val="28"/>
+          <w:szCs w:val="28"/>
+        </w:rPr>
+      </w:pPr>
+      <w:proofErr w:type="gramStart"/>
+      <w:r>
+        <w:rPr>
+          <w:rFonts w:ascii="Arial" w:hAnsi="Arial" w:cs="Arial"/>
+          <w:sz w:val="28"/>
+          <w:szCs w:val="28"/>
+        </w:rPr>
+        <w:t>Cuándo</w:t>
+      </w:r>
+      <w:proofErr w:type="gramEnd"/>
+      <w:r>
+        <w:rPr>
+          <w:rFonts w:ascii="Arial" w:hAnsi="Arial" w:cs="Arial"/>
+          <w:sz w:val="28"/>
+          <w:szCs w:val="28"/>
+        </w:rPr>
+        <w:t xml:space="preserve"> no vale la pena complicarse con </w:t>
+      </w:r>
+      <w:proofErr w:type="spellStart"/>
+      <w:r>
+        <w:rPr>
+          <w:rFonts w:ascii="Arial" w:hAnsi="Arial" w:cs="Arial"/>
+          <w:sz w:val="28"/>
+          <w:szCs w:val="28"/>
+        </w:rPr>
+        <w:t>WebFlux</w:t>
+      </w:r>
+      <w:proofErr w:type="spellEnd"/>
+      <w:r>
+        <w:rPr>
+          <w:rFonts w:ascii="Arial" w:hAnsi="Arial" w:cs="Arial"/>
+          <w:sz w:val="28"/>
+          <w:szCs w:val="28"/>
+        </w:rPr>
+        <w:t xml:space="preserve">: Todo esto no sirve de nada si dentro del proyecto metes código que sí bloquea, por </w:t>
+      </w:r>
+      <w:proofErr w:type="gramStart"/>
+      <w:r>
+        <w:rPr>
+          <w:rFonts w:ascii="Arial" w:hAnsi="Arial" w:cs="Arial"/>
+          <w:sz w:val="28"/>
+          <w:szCs w:val="28"/>
+        </w:rPr>
+        <w:t>ejemplo</w:t>
+      </w:r>
+      <w:proofErr w:type="gramEnd"/>
+      <w:r>
+        <w:rPr>
+          <w:rFonts w:ascii="Arial" w:hAnsi="Arial" w:cs="Arial"/>
+          <w:sz w:val="28"/>
+          <w:szCs w:val="28"/>
+        </w:rPr>
+        <w:t xml:space="preserve"> al usar el clásico JPA o JDBC para bases de datos relacionales. Además, con la salida de Java 21 y los famosos Virtual </w:t>
+      </w:r>
+      <w:proofErr w:type="spellStart"/>
+      <w:r>
+        <w:rPr>
+          <w:rFonts w:ascii="Arial" w:hAnsi="Arial" w:cs="Arial"/>
+          <w:sz w:val="28"/>
+          <w:szCs w:val="28"/>
+        </w:rPr>
+        <w:t>Threads</w:t>
+      </w:r>
+      <w:proofErr w:type="spellEnd"/>
+      <w:r>
+        <w:rPr>
+          <w:rFonts w:ascii="Arial" w:hAnsi="Arial" w:cs="Arial"/>
+          <w:sz w:val="28"/>
+          <w:szCs w:val="28"/>
+        </w:rPr>
+        <w:t xml:space="preserve">, ya se puede lograr que el servidor aguante muchísimas peticiones usando el código imperativo de siempre, por lo que a veces ya no hace falta aventarse la curva de aprendizaje de </w:t>
+      </w:r>
+      <w:proofErr w:type="spellStart"/>
+      <w:r>
+        <w:rPr>
+          <w:rFonts w:ascii="Arial" w:hAnsi="Arial" w:cs="Arial"/>
+          <w:sz w:val="28"/>
+          <w:szCs w:val="28"/>
+        </w:rPr>
+        <w:t>WebFlux</w:t>
+      </w:r>
+      <w:proofErr w:type="spellEnd"/>
+      <w:r>
+        <w:rPr>
+          <w:rFonts w:ascii="Arial" w:hAnsi="Arial" w:cs="Arial"/>
+          <w:sz w:val="28"/>
+          <w:szCs w:val="28"/>
+        </w:rPr>
+        <w:t>.</w:t>
+      </w:r>
     </w:p>
     <w:sectPr>
       <w:pgSz w:w="12240" w:h="15840"/>
@@ -466,6 +1506,119 @@
 <file path=word/numbering.xml><?xml version="1.0" encoding="utf-8"?>
 <w:numbering xmlns:wpc="http://schemas.microsoft.com/office/word/2010/wordprocessingCanvas" xmlns:cx="http://schemas.microsoft.com/office/drawing/2014/chartex" xmlns:cx1="http://schemas.microsoft.com/office/drawing/2015/9/8/chartex" xmlns:cx2="http://schemas.microsoft.com/office/drawing/2015/10/21/chartex" xmlns:cx3="http://schemas.microsoft.com/office/drawing/2016/5/9/chartex" xmlns:cx4="http://schemas.microsoft.com/office/drawing/2016/5/10/chartex" xmlns:cx5="http://schemas.microsoft.com/office/drawing/2016/5/11/chartex" xmlns:cx6="http://schemas.microsoft.com/office/drawing/2016/5/12/chartex" xmlns:cx7="http://schemas.microsoft.com/office/drawing/2016/5/13/chartex" xmlns:cx8="http://schemas.microsoft.com/office/drawing/2016/5/14/chartex" xmlns:mc="http://schemas.openxmlformats.org/markup-compatibility/2006" xmlns:aink="http://schemas.microsoft.com/office/drawing/2016/ink" xmlns:am3d="http://schemas.microsoft.com/office/drawing/2017/model3d" xmlns:o="urn:schemas-microsoft-com:office:office" xmlns:oel="http://schemas.microsoft.com/office/2019/extlst" xmlns:r="http://schemas.openxmlformats.org/officeDocument/2006/relationships" xmlns:m="http://schemas.openxmlformats.org/officeDocument/2006/math" xmlns:v="urn:schemas-microsoft-com:vml" xmlns:wp14="http://schemas.microsoft.com/office/word/2010/wordprocessingDrawing" xmlns:wp="http://schemas.openxmlformats.org/drawingml/2006/wordprocessingDrawing" xmlns:w10="urn:schemas-microsoft-com:office:word" xmlns:w="http://schemas.openxmlformats.org/wordprocessingml/2006/main" xmlns:w14="http://schemas.microsoft.com/office/word/2010/wordml" xmlns:w15="http://schemas.microsoft.com/office/word/2012/wordml" xmlns:w16cex="http://schemas.microsoft.com/office/word/2018/wordml/cex" xmlns:w16cid="http://schemas.microsoft.com/office/word/2016/wordml/cid" xmlns:w16="http://schemas.microsoft.com/office/word/2018/wordml" xmlns:w16du="http://schemas.microsoft.com/office/word/2023/wordml/word16du" xmlns:w16sdtdh="http://schemas.microsoft.com/office/word/2020/wordml/sdtdatahash" xmlns:w16sdtfl="http://schemas.microsoft.com/office/word/2024/wordml/sdtformatlock" xmlns:w16se="http://schemas.microsoft.com/office/word/2015/wordml/symex" xmlns:wpg="http://schemas.microsoft.com/office/word/2010/wordprocessingGroup" xmlns:wpi="http://schemas.microsoft.com/office/word/2010/wordprocessingInk" xmlns:wne="http://schemas.microsoft.com/office/word/2006/wordml" xmlns:wps="http://schemas.microsoft.com/office/word/2010/wordprocessingShape" mc:Ignorable="w14 w15 w16se w16cid w16 w16cex w16sdtdh w16sdtfl w16du wp14">
   <w:abstractNum w:abstractNumId="0" w15:restartNumberingAfterBreak="0">
+    <w:nsid w:val="01135427"/>
+    <w:multiLevelType w:val="hybridMultilevel"/>
+    <w:tmpl w:val="28D83FC4"/>
+    <w:lvl w:ilvl="0" w:tplc="080A0001">
+      <w:start w:val="1"/>
+      <w:numFmt w:val="bullet"/>
+      <w:lvlText w:val=""/>
+      <w:lvlJc w:val="left"/>
+      <w:pPr>
+        <w:ind w:left="720" w:hanging="360"/>
+      </w:pPr>
+      <w:rPr>
+        <w:rFonts w:ascii="Symbol" w:hAnsi="Symbol" w:hint="default"/>
+      </w:rPr>
+    </w:lvl>
+    <w:lvl w:ilvl="1" w:tplc="080A0003" w:tentative="1">
+      <w:start w:val="1"/>
+      <w:numFmt w:val="bullet"/>
+      <w:lvlText w:val="o"/>
+      <w:lvlJc w:val="left"/>
+      <w:pPr>
+        <w:ind w:left="1440" w:hanging="360"/>
+      </w:pPr>
+      <w:rPr>
+        <w:rFonts w:ascii="Courier New" w:hAnsi="Courier New" w:cs="Courier New" w:hint="default"/>
+      </w:rPr>
+    </w:lvl>
+    <w:lvl w:ilvl="2" w:tplc="080A0005" w:tentative="1">
+      <w:start w:val="1"/>
+      <w:numFmt w:val="bullet"/>
+      <w:lvlText w:val=""/>
+      <w:lvlJc w:val="left"/>
+      <w:pPr>
+        <w:ind w:left="2160" w:hanging="360"/>
+      </w:pPr>
+      <w:rPr>
+        <w:rFonts w:ascii="Wingdings" w:hAnsi="Wingdings" w:hint="default"/>
+      </w:rPr>
+    </w:lvl>
+    <w:lvl w:ilvl="3" w:tplc="080A0001" w:tentative="1">
+      <w:start w:val="1"/>
+      <w:numFmt w:val="bullet"/>
+      <w:lvlText w:val=""/>
+      <w:lvlJc w:val="left"/>
+      <w:pPr>
+        <w:ind w:left="2880" w:hanging="360"/>
+      </w:pPr>
+      <w:rPr>
+        <w:rFonts w:ascii="Symbol" w:hAnsi="Symbol" w:hint="default"/>
+      </w:rPr>
+    </w:lvl>
+    <w:lvl w:ilvl="4" w:tplc="080A0003" w:tentative="1">
+      <w:start w:val="1"/>
+      <w:numFmt w:val="bullet"/>
+      <w:lvlText w:val="o"/>
+      <w:lvlJc w:val="left"/>
+      <w:pPr>
+        <w:ind w:left="3600" w:hanging="360"/>
+      </w:pPr>
+      <w:rPr>
+        <w:rFonts w:ascii="Courier New" w:hAnsi="Courier New" w:cs="Courier New" w:hint="default"/>
+      </w:rPr>
+    </w:lvl>
+    <w:lvl w:ilvl="5" w:tplc="080A0005" w:tentative="1">
+      <w:start w:val="1"/>
+      <w:numFmt w:val="bullet"/>
+      <w:lvlText w:val=""/>
+      <w:lvlJc w:val="left"/>
+      <w:pPr>
+        <w:ind w:left="4320" w:hanging="360"/>
+      </w:pPr>
+      <w:rPr>
+        <w:rFonts w:ascii="Wingdings" w:hAnsi="Wingdings" w:hint="default"/>
+      </w:rPr>
+    </w:lvl>
+    <w:lvl w:ilvl="6" w:tplc="080A0001" w:tentative="1">
+      <w:start w:val="1"/>
+      <w:numFmt w:val="bullet"/>
+      <w:lvlText w:val=""/>
+      <w:lvlJc w:val="left"/>
+      <w:pPr>
+        <w:ind w:left="5040" w:hanging="360"/>
+      </w:pPr>
+      <w:rPr>
+        <w:rFonts w:ascii="Symbol" w:hAnsi="Symbol" w:hint="default"/>
+      </w:rPr>
+    </w:lvl>
+    <w:lvl w:ilvl="7" w:tplc="080A0003" w:tentative="1">
+      <w:start w:val="1"/>
+      <w:numFmt w:val="bullet"/>
+      <w:lvlText w:val="o"/>
+      <w:lvlJc w:val="left"/>
+      <w:pPr>
+        <w:ind w:left="5760" w:hanging="360"/>
+      </w:pPr>
+      <w:rPr>
+        <w:rFonts w:ascii="Courier New" w:hAnsi="Courier New" w:cs="Courier New" w:hint="default"/>
+      </w:rPr>
+    </w:lvl>
+    <w:lvl w:ilvl="8" w:tplc="080A0005" w:tentative="1">
+      <w:start w:val="1"/>
+      <w:numFmt w:val="bullet"/>
+      <w:lvlText w:val=""/>
+      <w:lvlJc w:val="left"/>
+      <w:pPr>
+        <w:ind w:left="6480" w:hanging="360"/>
+      </w:pPr>
+      <w:rPr>
+        <w:rFonts w:ascii="Wingdings" w:hAnsi="Wingdings" w:hint="default"/>
+      </w:rPr>
+    </w:lvl>
+  </w:abstractNum>
+  <w:abstractNum w:abstractNumId="1" w15:restartNumberingAfterBreak="0">
     <w:nsid w:val="10F37747"/>
     <w:multiLevelType w:val="hybridMultilevel"/>
     <w:tmpl w:val="61B280A4"/>
@@ -578,7 +1731,7 @@
       </w:rPr>
     </w:lvl>
   </w:abstractNum>
-  <w:abstractNum w:abstractNumId="1" w15:restartNumberingAfterBreak="0">
+  <w:abstractNum w:abstractNumId="2" w15:restartNumberingAfterBreak="0">
     <w:nsid w:val="25FE2A0F"/>
     <w:multiLevelType w:val="hybridMultilevel"/>
     <w:tmpl w:val="5B36BC20"/>
@@ -664,7 +1817,7 @@
       </w:pPr>
     </w:lvl>
   </w:abstractNum>
-  <w:abstractNum w:abstractNumId="2" w15:restartNumberingAfterBreak="0">
+  <w:abstractNum w:abstractNumId="3" w15:restartNumberingAfterBreak="0">
     <w:nsid w:val="2F59264D"/>
     <w:multiLevelType w:val="hybridMultilevel"/>
     <w:tmpl w:val="03424548"/>
@@ -777,7 +1930,7 @@
       </w:rPr>
     </w:lvl>
   </w:abstractNum>
-  <w:abstractNum w:abstractNumId="3" w15:restartNumberingAfterBreak="0">
+  <w:abstractNum w:abstractNumId="4" w15:restartNumberingAfterBreak="0">
     <w:nsid w:val="34D92AA7"/>
     <w:multiLevelType w:val="hybridMultilevel"/>
     <w:tmpl w:val="9BD840EC"/>
@@ -866,7 +2019,7 @@
       </w:pPr>
     </w:lvl>
   </w:abstractNum>
-  <w:abstractNum w:abstractNumId="4" w15:restartNumberingAfterBreak="0">
+  <w:abstractNum w:abstractNumId="5" w15:restartNumberingAfterBreak="0">
     <w:nsid w:val="404B45D0"/>
     <w:multiLevelType w:val="hybridMultilevel"/>
     <w:tmpl w:val="16FC12FC"/>
@@ -979,7 +2132,7 @@
       </w:rPr>
     </w:lvl>
   </w:abstractNum>
-  <w:abstractNum w:abstractNumId="5" w15:restartNumberingAfterBreak="0">
+  <w:abstractNum w:abstractNumId="6" w15:restartNumberingAfterBreak="0">
     <w:nsid w:val="51EE59D1"/>
     <w:multiLevelType w:val="hybridMultilevel"/>
     <w:tmpl w:val="F560E480"/>
@@ -1065,7 +2218,7 @@
       </w:pPr>
     </w:lvl>
   </w:abstractNum>
-  <w:abstractNum w:abstractNumId="6" w15:restartNumberingAfterBreak="0">
+  <w:abstractNum w:abstractNumId="7" w15:restartNumberingAfterBreak="0">
     <w:nsid w:val="55D80332"/>
     <w:multiLevelType w:val="hybridMultilevel"/>
     <w:tmpl w:val="67B0255E"/>
@@ -1154,7 +2307,120 @@
       </w:pPr>
     </w:lvl>
   </w:abstractNum>
-  <w:abstractNum w:abstractNumId="7" w15:restartNumberingAfterBreak="0">
+  <w:abstractNum w:abstractNumId="8" w15:restartNumberingAfterBreak="0">
+    <w:nsid w:val="60FD2781"/>
+    <w:multiLevelType w:val="hybridMultilevel"/>
+    <w:tmpl w:val="54FCD0A0"/>
+    <w:lvl w:ilvl="0" w:tplc="080A0001">
+      <w:start w:val="1"/>
+      <w:numFmt w:val="bullet"/>
+      <w:lvlText w:val=""/>
+      <w:lvlJc w:val="left"/>
+      <w:pPr>
+        <w:ind w:left="720" w:hanging="360"/>
+      </w:pPr>
+      <w:rPr>
+        <w:rFonts w:ascii="Symbol" w:hAnsi="Symbol" w:hint="default"/>
+      </w:rPr>
+    </w:lvl>
+    <w:lvl w:ilvl="1" w:tplc="080A0003" w:tentative="1">
+      <w:start w:val="1"/>
+      <w:numFmt w:val="bullet"/>
+      <w:lvlText w:val="o"/>
+      <w:lvlJc w:val="left"/>
+      <w:pPr>
+        <w:ind w:left="1440" w:hanging="360"/>
+      </w:pPr>
+      <w:rPr>
+        <w:rFonts w:ascii="Courier New" w:hAnsi="Courier New" w:cs="Courier New" w:hint="default"/>
+      </w:rPr>
+    </w:lvl>
+    <w:lvl w:ilvl="2" w:tplc="080A0005" w:tentative="1">
+      <w:start w:val="1"/>
+      <w:numFmt w:val="bullet"/>
+      <w:lvlText w:val=""/>
+      <w:lvlJc w:val="left"/>
+      <w:pPr>
+        <w:ind w:left="2160" w:hanging="360"/>
+      </w:pPr>
+      <w:rPr>
+        <w:rFonts w:ascii="Wingdings" w:hAnsi="Wingdings" w:hint="default"/>
+      </w:rPr>
+    </w:lvl>
+    <w:lvl w:ilvl="3" w:tplc="080A0001" w:tentative="1">
+      <w:start w:val="1"/>
+      <w:numFmt w:val="bullet"/>
+      <w:lvlText w:val=""/>
+      <w:lvlJc w:val="left"/>
+      <w:pPr>
+        <w:ind w:left="2880" w:hanging="360"/>
+      </w:pPr>
+      <w:rPr>
+        <w:rFonts w:ascii="Symbol" w:hAnsi="Symbol" w:hint="default"/>
+      </w:rPr>
+    </w:lvl>
+    <w:lvl w:ilvl="4" w:tplc="080A0003" w:tentative="1">
+      <w:start w:val="1"/>
+      <w:numFmt w:val="bullet"/>
+      <w:lvlText w:val="o"/>
+      <w:lvlJc w:val="left"/>
+      <w:pPr>
+        <w:ind w:left="3600" w:hanging="360"/>
+      </w:pPr>
+      <w:rPr>
+        <w:rFonts w:ascii="Courier New" w:hAnsi="Courier New" w:cs="Courier New" w:hint="default"/>
+      </w:rPr>
+    </w:lvl>
+    <w:lvl w:ilvl="5" w:tplc="080A0005" w:tentative="1">
+      <w:start w:val="1"/>
+      <w:numFmt w:val="bullet"/>
+      <w:lvlText w:val=""/>
+      <w:lvlJc w:val="left"/>
+      <w:pPr>
+        <w:ind w:left="4320" w:hanging="360"/>
+      </w:pPr>
+      <w:rPr>
+        <w:rFonts w:ascii="Wingdings" w:hAnsi="Wingdings" w:hint="default"/>
+      </w:rPr>
+    </w:lvl>
+    <w:lvl w:ilvl="6" w:tplc="080A0001" w:tentative="1">
+      <w:start w:val="1"/>
+      <w:numFmt w:val="bullet"/>
+      <w:lvlText w:val=""/>
+      <w:lvlJc w:val="left"/>
+      <w:pPr>
+        <w:ind w:left="5040" w:hanging="360"/>
+      </w:pPr>
+      <w:rPr>
+        <w:rFonts w:ascii="Symbol" w:hAnsi="Symbol" w:hint="default"/>
+      </w:rPr>
+    </w:lvl>
+    <w:lvl w:ilvl="7" w:tplc="080A0003" w:tentative="1">
+      <w:start w:val="1"/>
+      <w:numFmt w:val="bullet"/>
+      <w:lvlText w:val="o"/>
+      <w:lvlJc w:val="left"/>
+      <w:pPr>
+        <w:ind w:left="5760" w:hanging="360"/>
+      </w:pPr>
+      <w:rPr>
+        <w:rFonts w:ascii="Courier New" w:hAnsi="Courier New" w:cs="Courier New" w:hint="default"/>
+      </w:rPr>
+    </w:lvl>
+    <w:lvl w:ilvl="8" w:tplc="080A0005" w:tentative="1">
+      <w:start w:val="1"/>
+      <w:numFmt w:val="bullet"/>
+      <w:lvlText w:val=""/>
+      <w:lvlJc w:val="left"/>
+      <w:pPr>
+        <w:ind w:left="6480" w:hanging="360"/>
+      </w:pPr>
+      <w:rPr>
+        <w:rFonts w:ascii="Wingdings" w:hAnsi="Wingdings" w:hint="default"/>
+      </w:rPr>
+    </w:lvl>
+  </w:abstractNum>
+  <w:abstractNum w:abstractNumId="9" w15:restartNumberingAfterBreak="0">
     <w:nsid w:val="61ED003A"/>
     <w:multiLevelType w:val="hybridMultilevel"/>
     <w:tmpl w:val="9D32FD36"/>
@@ -1267,7 +2533,7 @@
       </w:rPr>
     </w:lvl>
   </w:abstractNum>
-  <w:abstractNum w:abstractNumId="8" w15:restartNumberingAfterBreak="0">
+  <w:abstractNum w:abstractNumId="10" w15:restartNumberingAfterBreak="0">
     <w:nsid w:val="63224A80"/>
     <w:multiLevelType w:val="hybridMultilevel"/>
     <w:tmpl w:val="996C500E"/>
@@ -1380,7 +2646,7 @@
       </w:rPr>
     </w:lvl>
   </w:abstractNum>
-  <w:abstractNum w:abstractNumId="9" w15:restartNumberingAfterBreak="0">
+  <w:abstractNum w:abstractNumId="11" w15:restartNumberingAfterBreak="0">
     <w:nsid w:val="74536325"/>
     <w:multiLevelType w:val="hybridMultilevel"/>
     <w:tmpl w:val="B47C9E08"/>
@@ -1493,7 +2759,7 @@
       </w:rPr>
     </w:lvl>
   </w:abstractNum>
-  <w:abstractNum w:abstractNumId="10" w15:restartNumberingAfterBreak="0">
+  <w:abstractNum w:abstractNumId="12" w15:restartNumberingAfterBreak="0">
     <w:nsid w:val="769F78DB"/>
     <w:multiLevelType w:val="hybridMultilevel"/>
     <w:tmpl w:val="E94C8CC4"/>
@@ -1606,7 +2872,120 @@
       </w:rPr>
     </w:lvl>
   </w:abstractNum>
-  <w:abstractNum w:abstractNumId="11" w15:restartNumberingAfterBreak="0">
+  <w:abstractNum w:abstractNumId="13" w15:restartNumberingAfterBreak="0">
+    <w:nsid w:val="7BD039D9"/>
+    <w:multiLevelType w:val="hybridMultilevel"/>
+    <w:tmpl w:val="03845118"/>
+    <w:lvl w:ilvl="0" w:tplc="080A0001">
+      <w:start w:val="1"/>
+      <w:numFmt w:val="bullet"/>
+      <w:lvlText w:val=""/>
+      <w:lvlJc w:val="left"/>
+      <w:pPr>
+        <w:ind w:left="720" w:hanging="360"/>
+      </w:pPr>
+      <w:rPr>
+        <w:rFonts w:ascii="Symbol" w:hAnsi="Symbol" w:hint="default"/>
+      </w:rPr>
+    </w:lvl>
+    <w:lvl w:ilvl="1" w:tplc="080A0003" w:tentative="1">
+      <w:start w:val="1"/>
+      <w:numFmt w:val="bullet"/>
+      <w:lvlText w:val="o"/>
+      <w:lvlJc w:val="left"/>
+      <w:pPr>
+        <w:ind w:left="1440" w:hanging="360"/>
+      </w:pPr>
+      <w:rPr>
+        <w:rFonts w:ascii="Courier New" w:hAnsi="Courier New" w:cs="Courier New" w:hint="default"/>
+      </w:rPr>
+    </w:lvl>
+    <w:lvl w:ilvl="2" w:tplc="080A0005" w:tentative="1">
+      <w:start w:val="1"/>
+      <w:numFmt w:val="bullet"/>
+      <w:lvlText w:val=""/>
+      <w:lvlJc w:val="left"/>
+      <w:pPr>
+        <w:ind w:left="2160" w:hanging="360"/>
+      </w:pPr>
+      <w:rPr>
+        <w:rFonts w:ascii="Wingdings" w:hAnsi="Wingdings" w:hint="default"/>
+      </w:rPr>
+    </w:lvl>
+    <w:lvl w:ilvl="3" w:tplc="080A0001" w:tentative="1">
+      <w:start w:val="1"/>
+      <w:numFmt w:val="bullet"/>
+      <w:lvlText w:val=""/>
+      <w:lvlJc w:val="left"/>
+      <w:pPr>
+        <w:ind w:left="2880" w:hanging="360"/>
+      </w:pPr>
+      <w:rPr>
+        <w:rFonts w:ascii="Symbol" w:hAnsi="Symbol" w:hint="default"/>
+      </w:rPr>
+    </w:lvl>
+    <w:lvl w:ilvl="4" w:tplc="080A0003" w:tentative="1">
+      <w:start w:val="1"/>
+      <w:numFmt w:val="bullet"/>
+      <w:lvlText w:val="o"/>
+      <w:lvlJc w:val="left"/>
+      <w:pPr>
+        <w:ind w:left="3600" w:hanging="360"/>
+      </w:pPr>
+      <w:rPr>
+        <w:rFonts w:ascii="Courier New" w:hAnsi="Courier New" w:cs="Courier New" w:hint="default"/>
+      </w:rPr>
+    </w:lvl>
+    <w:lvl w:ilvl="5" w:tplc="080A0005" w:tentative="1">
+      <w:start w:val="1"/>
+      <w:numFmt w:val="bullet"/>
+      <w:lvlText w:val=""/>
+      <w:lvlJc w:val="left"/>
+      <w:pPr>
+        <w:ind w:left="4320" w:hanging="360"/>
+      </w:pPr>
+      <w:rPr>
+        <w:rFonts w:ascii="Wingdings" w:hAnsi="Wingdings" w:hint="default"/>
+      </w:rPr>
+    </w:lvl>
+    <w:lvl w:ilvl="6" w:tplc="080A0001" w:tentative="1">
+      <w:start w:val="1"/>
+      <w:numFmt w:val="bullet"/>
+      <w:lvlText w:val=""/>
+      <w:lvlJc w:val="left"/>
+      <w:pPr>
+        <w:ind w:left="5040" w:hanging="360"/>
+      </w:pPr>
+      <w:rPr>
+        <w:rFonts w:ascii="Symbol" w:hAnsi="Symbol" w:hint="default"/>
+      </w:rPr>
+    </w:lvl>
+    <w:lvl w:ilvl="7" w:tplc="080A0003" w:tentative="1">
+      <w:start w:val="1"/>
+      <w:numFmt w:val="bullet"/>
+      <w:lvlText w:val="o"/>
+      <w:lvlJc w:val="left"/>
+      <w:pPr>
+        <w:ind w:left="5760" w:hanging="360"/>
+      </w:pPr>
+      <w:rPr>
+        <w:rFonts w:ascii="Courier New" w:hAnsi="Courier New" w:cs="Courier New" w:hint="default"/>
+      </w:rPr>
+    </w:lvl>
+    <w:lvl w:ilvl="8" w:tplc="080A0005" w:tentative="1">
+      <w:start w:val="1"/>
+      <w:numFmt w:val="bullet"/>
+      <w:lvlText w:val=""/>
+      <w:lvlJc w:val="left"/>
+      <w:pPr>
+        <w:ind w:left="6480" w:hanging="360"/>
+      </w:pPr>
+      <w:rPr>
+        <w:rFonts w:ascii="Wingdings" w:hAnsi="Wingdings" w:hint="default"/>
+      </w:rPr>
+    </w:lvl>
+  </w:abstractNum>
+  <w:abstractNum w:abstractNumId="14" w15:restartNumberingAfterBreak="0">
     <w:nsid w:val="7E63695A"/>
     <w:multiLevelType w:val="hybridMultilevel"/>
     <w:tmpl w:val="D4007F40"/>
@@ -1720,40 +3099,49 @@
     </w:lvl>
   </w:abstractNum>
   <w:num w:numId="1" w16cid:durableId="62336987">
+    <w:abstractNumId w:val="7"/>
+  </w:num>
+  <w:num w:numId="2" w16cid:durableId="1275552115">
+    <w:abstractNumId w:val="4"/>
+  </w:num>
+  <w:num w:numId="3" w16cid:durableId="168952982">
+    <w:abstractNumId w:val="2"/>
+  </w:num>
+  <w:num w:numId="4" w16cid:durableId="876746011">
     <w:abstractNumId w:val="6"/>
   </w:num>
-  <w:num w:numId="2" w16cid:durableId="1275552115">
+  <w:num w:numId="5" w16cid:durableId="698555882">
+    <w:abstractNumId w:val="5"/>
+  </w:num>
+  <w:num w:numId="6" w16cid:durableId="48117909">
+    <w:abstractNumId w:val="9"/>
+  </w:num>
+  <w:num w:numId="7" w16cid:durableId="678853906">
+    <w:abstractNumId w:val="14"/>
+  </w:num>
+  <w:num w:numId="8" w16cid:durableId="1565605666">
     <w:abstractNumId w:val="3"/>
   </w:num>
-  <w:num w:numId="3" w16cid:durableId="168952982">
+  <w:num w:numId="9" w16cid:durableId="1977907804">
+    <w:abstractNumId w:val="10"/>
+  </w:num>
+  <w:num w:numId="10" w16cid:durableId="523206483">
+    <w:abstractNumId w:val="12"/>
+  </w:num>
+  <w:num w:numId="11" w16cid:durableId="997801477">
     <w:abstractNumId w:val="1"/>
   </w:num>
-  <w:num w:numId="4" w16cid:durableId="876746011">
-    <w:abstractNumId w:val="5"/>
-  </w:num>
-  <w:num w:numId="5" w16cid:durableId="698555882">
-    <w:abstractNumId w:val="4"/>
-  </w:num>
-  <w:num w:numId="6" w16cid:durableId="48117909">
-    <w:abstractNumId w:val="7"/>
-  </w:num>
-  <w:num w:numId="7" w16cid:durableId="678853906">
+  <w:num w:numId="12" w16cid:durableId="1321346736">
     <w:abstractNumId w:val="11"/>
   </w:num>
-  <w:num w:numId="8" w16cid:durableId="1565605666">
-    <w:abstractNumId w:val="2"/>
-  </w:num>
-  <w:num w:numId="9" w16cid:durableId="1977907804">
-    <w:abstractNumId w:val="8"/>
-  </w:num>
-  <w:num w:numId="10" w16cid:durableId="523206483">
-    <w:abstractNumId w:val="10"/>
-  </w:num>
-  <w:num w:numId="11" w16cid:durableId="997801477">
+  <w:num w:numId="13" w16cid:durableId="68119759">
     <w:abstractNumId w:val="0"/>
   </w:num>
-  <w:num w:numId="12" w16cid:durableId="1321346736">
-    <w:abstractNumId w:val="9"/>
+  <w:num w:numId="14" w16cid:durableId="1429155869">
+    <w:abstractNumId w:val="13"/>
+  </w:num>
+  <w:num w:numId="15" w16cid:durableId="813377217">
+    <w:abstractNumId w:val="8"/>
   </w:num>
 </w:numbering>
 </file>

</xml_diff>